<commit_message>
fix: improve Kubernetes CD rollout and health checks and final README and Report
</commit_message>
<xml_diff>
--- a/MLOps_Assignment_2_Final_Report.docx
+++ b/MLOps_Assignment_2_Final_Report.docx
@@ -72,25 +72,7 @@
                 <w:sz w:val="28"/>
                 <w:szCs w:val="28"/>
               </w:rPr>
-              <w:t xml:space="preserve">Course: </w:t>
-            </w:r>
-            <w:proofErr w:type="spellStart"/>
-            <w:r>
-              <w:rPr>
-                <w:rFonts w:ascii="Calibri" w:hAnsi="Calibri"/>
-                <w:sz w:val="28"/>
-                <w:szCs w:val="28"/>
-              </w:rPr>
-              <w:t>MLOps</w:t>
-            </w:r>
-            <w:proofErr w:type="spellEnd"/>
-            <w:r>
-              <w:rPr>
-                <w:rFonts w:ascii="Calibri" w:hAnsi="Calibri"/>
-                <w:sz w:val="28"/>
-                <w:szCs w:val="28"/>
-              </w:rPr>
-              <w:t xml:space="preserve"> (S1-25_AIMLCZG523)</w:t>
+              <w:t>Course: MLOps (S1-25_AIMLCZG523)</w:t>
             </w:r>
             <w:r>
               <w:rPr>
@@ -108,7 +90,23 @@
                 <w:szCs w:val="28"/>
               </w:rPr>
               <w:br/>
-              <w:t>Student ID: 2024ac05033</w:t>
+              <w:t>Student ID: 2024</w:t>
+            </w:r>
+            <w:r>
+              <w:rPr>
+                <w:rFonts w:ascii="Calibri" w:hAnsi="Calibri"/>
+                <w:sz w:val="28"/>
+                <w:szCs w:val="28"/>
+              </w:rPr>
+              <w:t>AC</w:t>
+            </w:r>
+            <w:r>
+              <w:rPr>
+                <w:rFonts w:ascii="Calibri" w:hAnsi="Calibri"/>
+                <w:sz w:val="28"/>
+                <w:szCs w:val="28"/>
+              </w:rPr>
+              <w:t>05033</w:t>
             </w:r>
           </w:p>
         </w:tc>
@@ -116,56 +114,13 @@
     </w:tbl>
     <w:p>
       <w:pPr>
-        <w:spacing w:after="240"/>
-      </w:pPr>
-    </w:p>
-    <w:p>
-      <w:pPr>
-        <w:spacing w:before="80" w:after="80"/>
-      </w:pPr>
-    </w:p>
-    <w:p>
-      <w:pPr>
         <w:pStyle w:val="Heading2"/>
         <w:spacing w:before="280" w:after="120"/>
-      </w:pPr>
-      <w:r>
         <w:rPr>
           <w:rFonts w:ascii="Calibri" w:hAnsi="Calibri"/>
           <w:color w:val="4F81BD"/>
           <w:sz w:val="28"/>
         </w:rPr>
-        <w:t>1. Problem Statement</w:t>
-      </w:r>
-    </w:p>
-    <w:p>
-      <w:pPr>
-        <w:spacing w:after="120"/>
-      </w:pPr>
-      <w:r>
-        <w:t xml:space="preserve">The objective of this assignment is to design and implement an end-to-end MLOps pipeline for a pet adoption platform. The specific use case is </w:t>
-      </w:r>
-      <w:r>
-        <w:rPr>
-          <w:b/>
-        </w:rPr>
-        <w:t>binary image classification (Cats vs Dogs)</w:t>
-      </w:r>
-      <w:r>
-        <w:t>. Users of the pet adoption platform upload pictures of pets, and the system must automatically classify the upload as either a "cat" or a "dog" to streamline categorization, metadata tagging, and search indexing.</w:t>
-      </w:r>
-    </w:p>
-    <w:p>
-      <w:pPr>
-        <w:spacing w:after="120"/>
-      </w:pPr>
-      <w:r>
-        <w:t>The core engineering challenge is to bridge the gap between local model development (training a machine learning model, tracking experiments, and versioning data) and production deployment (building reproducible containers, setting up continuous integration, deploying to local Kubernetes, verifying deployment safety, and tracking real-time observability metrics).</w:t>
-      </w:r>
-    </w:p>
-    <w:p>
-      <w:pPr>
-        <w:spacing w:before="80" w:after="80"/>
       </w:pPr>
     </w:p>
     <w:p>
@@ -179,6 +134,91 @@
           <w:color w:val="4F81BD"/>
           <w:sz w:val="28"/>
         </w:rPr>
+        <w:t>GitHub Repository Link</w:t>
+      </w:r>
+    </w:p>
+    <w:p>
+      <w:pPr>
+        <w:spacing w:after="120"/>
+      </w:pPr>
+      <w:r>
+        <w:t>The complete codebase, configurations, and manifests are versioned at:</w:t>
+      </w:r>
+    </w:p>
+    <w:p>
+      <w:pPr>
+        <w:spacing w:after="120"/>
+      </w:pPr>
+      <w:hyperlink r:id="rId6" w:history="1">
+        <w:r>
+          <w:rPr>
+            <w:rStyle w:val="Hyperlink"/>
+            <w:b/>
+          </w:rPr>
+          <w:t>https://github.com/varpeprasanna/BITS-MTech-MLOps-Assignment-2</w:t>
+        </w:r>
+      </w:hyperlink>
+    </w:p>
+    <w:p>
+      <w:pPr>
+        <w:spacing w:before="80" w:after="80"/>
+      </w:pPr>
+    </w:p>
+    <w:p>
+      <w:pPr>
+        <w:pStyle w:val="Heading2"/>
+        <w:spacing w:before="280" w:after="120"/>
+      </w:pPr>
+      <w:r>
+        <w:rPr>
+          <w:rFonts w:ascii="Calibri" w:hAnsi="Calibri"/>
+          <w:color w:val="4F81BD"/>
+          <w:sz w:val="28"/>
+        </w:rPr>
+        <w:t>1. Problem Statement</w:t>
+      </w:r>
+    </w:p>
+    <w:p>
+      <w:pPr>
+        <w:spacing w:after="120"/>
+      </w:pPr>
+      <w:r>
+        <w:t xml:space="preserve">The objective of this assignment is to design and implement an end-to-end MLOps pipeline for a pet adoption platform. The specific use case is </w:t>
+      </w:r>
+      <w:r>
+        <w:rPr>
+          <w:b/>
+        </w:rPr>
+        <w:t>binary image classification (Cats vs Dogs)</w:t>
+      </w:r>
+      <w:r>
+        <w:t>. Users of the pet adoption platform upload pictures of pets, and the system must automatically classify the upload as either a "cat" or a "dog" to streamline categorization, metadata tagging, and search indexing.</w:t>
+      </w:r>
+    </w:p>
+    <w:p>
+      <w:pPr>
+        <w:spacing w:after="120"/>
+      </w:pPr>
+      <w:r>
+        <w:t>The core engineering challenge is to bridge the gap between local model development (training a machine learning model, tracking experiments, and versioning data) and production deployment (building reproducible containers, setting up continuous integration, deploying to local Kubernetes, verifying deployment safety, and tracking real-time observability metrics).</w:t>
+      </w:r>
+    </w:p>
+    <w:p>
+      <w:pPr>
+        <w:spacing w:before="80" w:after="80"/>
+      </w:pPr>
+    </w:p>
+    <w:p>
+      <w:pPr>
+        <w:pStyle w:val="Heading2"/>
+        <w:spacing w:before="280" w:after="120"/>
+      </w:pPr>
+      <w:r>
+        <w:rPr>
+          <w:rFonts w:ascii="Calibri" w:hAnsi="Calibri"/>
+          <w:color w:val="4F81BD"/>
+          <w:sz w:val="28"/>
+        </w:rPr>
         <w:t>2. Objectives</w:t>
       </w:r>
     </w:p>
@@ -212,6 +252,7 @@
         <w:spacing w:after="120"/>
       </w:pPr>
       <w:r>
+        <w:lastRenderedPageBreak/>
         <w:t xml:space="preserve">2. </w:t>
       </w:r>
       <w:r>
@@ -246,7 +287,6 @@
         <w:spacing w:after="120"/>
       </w:pPr>
       <w:r>
-        <w:lastRenderedPageBreak/>
         <w:t xml:space="preserve">4. </w:t>
       </w:r>
       <w:r>
@@ -377,14 +417,7 @@
           <w:rFonts w:ascii="Calibri" w:hAnsi="Calibri"/>
           <w:b/>
         </w:rPr>
-        <w:t>▪</w:t>
-      </w:r>
-      <w:r>
-        <w:rPr>
-          <w:rFonts w:ascii="Calibri" w:hAnsi="Calibri"/>
-          <w:b/>
-        </w:rPr>
-        <w:t xml:space="preserve">  </w:t>
+        <w:t xml:space="preserve">▪  </w:t>
       </w:r>
       <w:r>
         <w:t xml:space="preserve">Resized and rescaled to </w:t>
@@ -409,14 +442,7 @@
           <w:rFonts w:ascii="Calibri" w:hAnsi="Calibri"/>
           <w:b/>
         </w:rPr>
-        <w:t>▪</w:t>
-      </w:r>
-      <w:r>
-        <w:rPr>
-          <w:rFonts w:ascii="Calibri" w:hAnsi="Calibri"/>
-          <w:b/>
-        </w:rPr>
-        <w:t xml:space="preserve">  </w:t>
+        <w:t xml:space="preserve">▪  </w:t>
       </w:r>
       <w:r>
         <w:t xml:space="preserve">Normalized using standard ImageNet mean values </w:t>
@@ -454,14 +480,7 @@
           <w:rFonts w:ascii="Calibri" w:hAnsi="Calibri"/>
           <w:b/>
         </w:rPr>
-        <w:t>▪</w:t>
-      </w:r>
-      <w:r>
-        <w:rPr>
-          <w:rFonts w:ascii="Calibri" w:hAnsi="Calibri"/>
-          <w:b/>
-        </w:rPr>
-        <w:t xml:space="preserve">  </w:t>
+        <w:t xml:space="preserve">▪  </w:t>
       </w:r>
       <w:r>
         <w:t>Split into train, validation, and test subsets (using an 80% / 10% / 10% distribution).</w:t>
@@ -499,14 +518,7 @@
           <w:rFonts w:ascii="Calibri" w:hAnsi="Calibri"/>
           <w:b/>
         </w:rPr>
-        <w:t>▪</w:t>
-      </w:r>
-      <w:r>
-        <w:rPr>
-          <w:rFonts w:ascii="Calibri" w:hAnsi="Calibri"/>
-          <w:b/>
-        </w:rPr>
-        <w:t xml:space="preserve">  </w:t>
+        <w:t xml:space="preserve">▪  </w:t>
       </w:r>
       <w:r>
         <w:t>Random horizontal flips.</w:t>
@@ -522,14 +534,7 @@
           <w:rFonts w:ascii="Calibri" w:hAnsi="Calibri"/>
           <w:b/>
         </w:rPr>
-        <w:t>▪</w:t>
-      </w:r>
-      <w:r>
-        <w:rPr>
-          <w:rFonts w:ascii="Calibri" w:hAnsi="Calibri"/>
-          <w:b/>
-        </w:rPr>
-        <w:t xml:space="preserve">  </w:t>
+        <w:t xml:space="preserve">▪  </w:t>
       </w:r>
       <w:r>
         <w:t>Random rotations (up to 10 degrees).</w:t>
@@ -545,14 +550,7 @@
           <w:rFonts w:ascii="Calibri" w:hAnsi="Calibri"/>
           <w:b/>
         </w:rPr>
-        <w:t>▪</w:t>
-      </w:r>
-      <w:r>
-        <w:rPr>
-          <w:rFonts w:ascii="Calibri" w:hAnsi="Calibri"/>
-          <w:b/>
-        </w:rPr>
-        <w:t xml:space="preserve">  </w:t>
+        <w:t xml:space="preserve">▪  </w:t>
       </w:r>
       <w:r>
         <w:t>Color jittering (varying brightness, contrast, saturation by 0.2, and hue by 0.05).</w:t>
@@ -697,14 +695,8 @@
           <w:rFonts w:ascii="Calibri" w:hAnsi="Calibri"/>
           <w:b/>
         </w:rPr>
-        <w:t>▪</w:t>
-      </w:r>
-      <w:r>
-        <w:rPr>
-          <w:rFonts w:ascii="Calibri" w:hAnsi="Calibri"/>
-          <w:b/>
-        </w:rPr>
-        <w:t xml:space="preserve">  </w:t>
+        <w:lastRenderedPageBreak/>
+        <w:t xml:space="preserve">▪  </w:t>
       </w:r>
       <w:r>
         <w:rPr>
@@ -723,14 +715,7 @@
           <w:rFonts w:ascii="Calibri" w:hAnsi="Calibri"/>
           <w:b/>
         </w:rPr>
-        <w:t>▪</w:t>
-      </w:r>
-      <w:r>
-        <w:rPr>
-          <w:rFonts w:ascii="Calibri" w:hAnsi="Calibri"/>
-          <w:b/>
-        </w:rPr>
-        <w:t xml:space="preserve">  </w:t>
+        <w:t xml:space="preserve">▪  </w:t>
       </w:r>
       <w:r>
         <w:t>*Block 1:* Conv2d (3 to 32 channels, kernel size 3, padding 1) $\rightarrow$ BatchNorm2d $\rightarrow$ ReLU $\rightarrow$ MaxPool2d (kernel size 2).</w:t>
@@ -746,14 +731,7 @@
           <w:rFonts w:ascii="Calibri" w:hAnsi="Calibri"/>
           <w:b/>
         </w:rPr>
-        <w:t>▪</w:t>
-      </w:r>
-      <w:r>
-        <w:rPr>
-          <w:rFonts w:ascii="Calibri" w:hAnsi="Calibri"/>
-          <w:b/>
-        </w:rPr>
-        <w:t xml:space="preserve">  </w:t>
+        <w:t xml:space="preserve">▪  </w:t>
       </w:r>
       <w:r>
         <w:t>*Block 2:* Conv2d (32 to 64 channels, kernel size 3, padding 1) $\rightarrow$ BatchNorm2d $\rightarrow$ ReLU $\rightarrow$ MaxPool2d (kernel size 2).</w:t>
@@ -769,15 +747,7 @@
           <w:rFonts w:ascii="Calibri" w:hAnsi="Calibri"/>
           <w:b/>
         </w:rPr>
-        <w:lastRenderedPageBreak/>
-        <w:t>▪</w:t>
-      </w:r>
-      <w:r>
-        <w:rPr>
-          <w:rFonts w:ascii="Calibri" w:hAnsi="Calibri"/>
-          <w:b/>
-        </w:rPr>
-        <w:t xml:space="preserve">  </w:t>
+        <w:t xml:space="preserve">▪  </w:t>
       </w:r>
       <w:r>
         <w:t>*Block 3:* Conv2d (64 to 128 channels, kernel size 3, padding 1) $\rightarrow$ BatchNorm2d $\rightarrow$ ReLU $\rightarrow$ MaxPool2d (kernel size 2).</w:t>
@@ -793,14 +763,7 @@
           <w:rFonts w:ascii="Calibri" w:hAnsi="Calibri"/>
           <w:b/>
         </w:rPr>
-        <w:t>▪</w:t>
-      </w:r>
-      <w:r>
-        <w:rPr>
-          <w:rFonts w:ascii="Calibri" w:hAnsi="Calibri"/>
-          <w:b/>
-        </w:rPr>
-        <w:t xml:space="preserve">  </w:t>
+        <w:t xml:space="preserve">▪  </w:t>
       </w:r>
       <w:r>
         <w:rPr>
@@ -819,14 +782,7 @@
           <w:rFonts w:ascii="Calibri" w:hAnsi="Calibri"/>
           <w:b/>
         </w:rPr>
-        <w:t>▪</w:t>
-      </w:r>
-      <w:r>
-        <w:rPr>
-          <w:rFonts w:ascii="Calibri" w:hAnsi="Calibri"/>
-          <w:b/>
-        </w:rPr>
-        <w:t xml:space="preserve">  </w:t>
+        <w:t xml:space="preserve">▪  </w:t>
       </w:r>
       <w:r>
         <w:t>AdaptiveAvgPool2d (collapsing spatial dimensions to 1x1) $\rightarrow$ Flatten $\rightarrow$ Dropout (p=0.3) $\rightarrow$ Linear layer (128 outputs to 1 raw logit).</w:t>
@@ -1077,15 +1033,7 @@
                 <w:sz w:val="17"/>
               </w:rPr>
               <w:br/>
-              <w:t xml:space="preserve">                                  </w:t>
-            </w:r>
-            <w:r>
-              <w:rPr>
-                <w:rFonts w:ascii="Courier New" w:hAnsi="Courier New"/>
-                <w:color w:val="323232"/>
-                <w:sz w:val="17"/>
-              </w:rPr>
-              <w:t xml:space="preserve">    ▼</w:t>
+              <w:t xml:space="preserve">                                      ▼</w:t>
             </w:r>
             <w:r>
               <w:rPr>
@@ -1184,15 +1132,7 @@
                 <w:sz w:val="17"/>
               </w:rPr>
               <w:br/>
-              <w:t xml:space="preserve">                  </w:t>
-            </w:r>
-            <w:r>
-              <w:rPr>
-                <w:rFonts w:ascii="Courier New" w:hAnsi="Courier New"/>
-                <w:color w:val="323232"/>
-                <w:sz w:val="17"/>
-              </w:rPr>
-              <w:t xml:space="preserve">         │ /metrics            │</w:t>
+              <w:t xml:space="preserve">                           │ /metrics            │</w:t>
             </w:r>
             <w:r>
               <w:rPr>
@@ -1228,6 +1168,14 @@
                 <w:sz w:val="17"/>
               </w:rPr>
               <w:br/>
+            </w:r>
+            <w:r>
+              <w:rPr>
+                <w:rFonts w:ascii="Courier New" w:hAnsi="Courier New"/>
+                <w:color w:val="323232"/>
+                <w:sz w:val="17"/>
+              </w:rPr>
+              <w:lastRenderedPageBreak/>
               <w:t xml:space="preserve">                           ┌─────────────────────┐</w:t>
             </w:r>
             <w:r>
@@ -1291,15 +1239,7 @@
                 <w:sz w:val="17"/>
               </w:rPr>
               <w:br/>
-              <w:t xml:space="preserve">             </w:t>
-            </w:r>
-            <w:r>
-              <w:rPr>
-                <w:rFonts w:ascii="Courier New" w:hAnsi="Courier New"/>
-                <w:color w:val="323232"/>
-                <w:sz w:val="17"/>
-              </w:rPr>
-              <w:t xml:space="preserve">              │ Docker Build        │</w:t>
+              <w:t xml:space="preserve">                           │ Docker Build        │</w:t>
             </w:r>
             <w:r>
               <w:rPr>
@@ -1317,14 +1257,6 @@
                 <w:sz w:val="17"/>
               </w:rPr>
               <w:br/>
-            </w:r>
-            <w:r>
-              <w:rPr>
-                <w:rFonts w:ascii="Courier New" w:hAnsi="Courier New"/>
-                <w:color w:val="323232"/>
-                <w:sz w:val="17"/>
-              </w:rPr>
-              <w:lastRenderedPageBreak/>
               <w:t xml:space="preserve">                           └──────────┬──────────┘</w:t>
             </w:r>
             <w:r>
@@ -1406,15 +1338,7 @@
                 <w:sz w:val="17"/>
               </w:rPr>
               <w:br/>
-              <w:t xml:space="preserve">     </w:t>
-            </w:r>
-            <w:r>
-              <w:rPr>
-                <w:rFonts w:ascii="Courier New" w:hAnsi="Courier New"/>
-                <w:color w:val="323232"/>
-                <w:sz w:val="17"/>
-              </w:rPr>
-              <w:t xml:space="preserve">                                 │</w:t>
+              <w:t xml:space="preserve">                                      │</w:t>
             </w:r>
             <w:r>
               <w:rPr>
@@ -1513,13 +1437,6 @@
                 <w:sz w:val="17"/>
               </w:rPr>
               <w:br/>
-            </w:r>
-            <w:r>
-              <w:rPr>
-                <w:rFonts w:ascii="Courier New" w:hAnsi="Courier New"/>
-                <w:color w:val="323232"/>
-                <w:sz w:val="17"/>
-              </w:rPr>
               <w:t xml:space="preserve">                                      │</w:t>
             </w:r>
             <w:r>
@@ -1610,15 +1527,7 @@
                 <w:sz w:val="17"/>
               </w:rPr>
               <w:br/>
-              <w:t xml:space="preserve">                           │ Deployment + Serv</w:t>
-            </w:r>
-            <w:r>
-              <w:rPr>
-                <w:rFonts w:ascii="Courier New" w:hAnsi="Courier New"/>
-                <w:color w:val="323232"/>
-                <w:sz w:val="17"/>
-              </w:rPr>
-              <w:t>ice│</w:t>
+              <w:t xml:space="preserve">                           │ Deployment + Service│</w:t>
             </w:r>
             <w:r>
               <w:rPr>
@@ -1717,15 +1626,7 @@
                 <w:sz w:val="17"/>
               </w:rPr>
               <w:br/>
-              <w:t xml:space="preserve">                           │ Monitoring  </w:t>
-            </w:r>
-            <w:r>
-              <w:rPr>
-                <w:rFonts w:ascii="Courier New" w:hAnsi="Courier New"/>
-                <w:color w:val="323232"/>
-                <w:sz w:val="17"/>
-              </w:rPr>
-              <w:t xml:space="preserve">        │</w:t>
+              <w:t xml:space="preserve">                           │ Monitoring          │</w:t>
             </w:r>
             <w:r>
               <w:rPr>
@@ -1819,6 +1720,7 @@
           <w:color w:val="4F81BD"/>
           <w:sz w:val="28"/>
         </w:rPr>
+        <w:lastRenderedPageBreak/>
         <w:t>6. DVC Implementation</w:t>
       </w:r>
     </w:p>
@@ -1895,7 +1797,6 @@
           <w:rFonts w:ascii="Calibri" w:hAnsi="Calibri"/>
           <w:b/>
         </w:rPr>
-        <w:lastRenderedPageBreak/>
         <w:t xml:space="preserve">•  </w:t>
       </w:r>
       <w:r>
@@ -2047,14 +1948,7 @@
           <w:rFonts w:ascii="Calibri" w:hAnsi="Calibri"/>
           <w:b/>
         </w:rPr>
-        <w:t>▪</w:t>
-      </w:r>
-      <w:r>
-        <w:rPr>
-          <w:rFonts w:ascii="Calibri" w:hAnsi="Calibri"/>
-          <w:b/>
-        </w:rPr>
-        <w:t xml:space="preserve">  </w:t>
+        <w:t xml:space="preserve">▪  </w:t>
       </w:r>
       <w:r>
         <w:rPr>
@@ -2076,14 +1970,7 @@
           <w:rFonts w:ascii="Calibri" w:hAnsi="Calibri"/>
           <w:b/>
         </w:rPr>
-        <w:t>▪</w:t>
-      </w:r>
-      <w:r>
-        <w:rPr>
-          <w:rFonts w:ascii="Calibri" w:hAnsi="Calibri"/>
-          <w:b/>
-        </w:rPr>
-        <w:t xml:space="preserve">  </w:t>
+        <w:t xml:space="preserve">▪  </w:t>
       </w:r>
       <w:r>
         <w:rPr>
@@ -2105,14 +1992,7 @@
           <w:rFonts w:ascii="Calibri" w:hAnsi="Calibri"/>
           <w:b/>
         </w:rPr>
-        <w:t>▪</w:t>
-      </w:r>
-      <w:r>
-        <w:rPr>
-          <w:rFonts w:ascii="Calibri" w:hAnsi="Calibri"/>
-          <w:b/>
-        </w:rPr>
-        <w:t xml:space="preserve">  </w:t>
+        <w:t xml:space="preserve">▪  </w:t>
       </w:r>
       <w:r>
         <w:rPr>
@@ -2134,14 +2014,7 @@
           <w:rFonts w:ascii="Calibri" w:hAnsi="Calibri"/>
           <w:b/>
         </w:rPr>
-        <w:t>▪</w:t>
-      </w:r>
-      <w:r>
-        <w:rPr>
-          <w:rFonts w:ascii="Calibri" w:hAnsi="Calibri"/>
-          <w:b/>
-        </w:rPr>
-        <w:t xml:space="preserve">  </w:t>
+        <w:t xml:space="preserve">▪  </w:t>
       </w:r>
       <w:r>
         <w:rPr>
@@ -2163,14 +2036,7 @@
           <w:rFonts w:ascii="Calibri" w:hAnsi="Calibri"/>
           <w:b/>
         </w:rPr>
-        <w:t>▪</w:t>
-      </w:r>
-      <w:r>
-        <w:rPr>
-          <w:rFonts w:ascii="Calibri" w:hAnsi="Calibri"/>
-          <w:b/>
-        </w:rPr>
-        <w:t xml:space="preserve">  </w:t>
+        <w:t xml:space="preserve">▪  </w:t>
       </w:r>
       <w:r>
         <w:rPr>
@@ -2214,14 +2080,7 @@
           <w:rFonts w:ascii="Calibri" w:hAnsi="Calibri"/>
           <w:b/>
         </w:rPr>
-        <w:t>▪</w:t>
-      </w:r>
-      <w:r>
-        <w:rPr>
-          <w:rFonts w:ascii="Calibri" w:hAnsi="Calibri"/>
-          <w:b/>
-        </w:rPr>
-        <w:t xml:space="preserve">  </w:t>
+        <w:t xml:space="preserve">▪  </w:t>
       </w:r>
       <w:r>
         <w:t>*Metrics logged:* Train loss/accuracy, validation loss/accuracy, test loss, test accuracy, precision, recall, and F1-score.</w:t>
@@ -2237,14 +2096,7 @@
           <w:rFonts w:ascii="Calibri" w:hAnsi="Calibri"/>
           <w:b/>
         </w:rPr>
-        <w:t>▪</w:t>
-      </w:r>
-      <w:r>
-        <w:rPr>
-          <w:rFonts w:ascii="Calibri" w:hAnsi="Calibri"/>
-          <w:b/>
-        </w:rPr>
-        <w:t xml:space="preserve">  </w:t>
+        <w:t xml:space="preserve">▪  </w:t>
       </w:r>
       <w:r>
         <w:t>*Artifacts logged:* Training curves (loss/accuracy plots), confusion matrices, and serialized model files.</w:t>
@@ -2260,14 +2112,7 @@
           <w:rFonts w:ascii="Calibri" w:hAnsi="Calibri"/>
           <w:b/>
         </w:rPr>
-        <w:t>▪</w:t>
-      </w:r>
-      <w:r>
-        <w:rPr>
-          <w:rFonts w:ascii="Calibri" w:hAnsi="Calibri"/>
-          <w:b/>
-        </w:rPr>
-        <w:t xml:space="preserve">  </w:t>
+        <w:t xml:space="preserve">▪  </w:t>
       </w:r>
       <w:r>
         <w:t>*Traceability:* The PyTorch model signature is registered in MLflow (</w:t>
@@ -2402,6 +2247,7 @@
           <w:rFonts w:ascii="Calibri" w:hAnsi="Calibri"/>
           <w:b/>
         </w:rPr>
+        <w:lastRenderedPageBreak/>
         <w:t xml:space="preserve">•  </w:t>
       </w:r>
       <w:r>
@@ -2504,7 +2350,6 @@
           <w:color w:val="4F81BD"/>
           <w:sz w:val="28"/>
         </w:rPr>
-        <w:lastRenderedPageBreak/>
         <w:t>9. Dockerization</w:t>
       </w:r>
     </w:p>
@@ -2916,6 +2761,7 @@
         <w:spacing w:after="120"/>
       </w:pPr>
       <w:r>
+        <w:lastRenderedPageBreak/>
         <w:t xml:space="preserve">6. </w:t>
       </w:r>
       <w:r>
@@ -3015,7 +2861,6 @@
           <w:rFonts w:ascii="Calibri" w:hAnsi="Calibri"/>
           <w:b/>
         </w:rPr>
-        <w:lastRenderedPageBreak/>
         <w:t xml:space="preserve">•  </w:t>
       </w:r>
       <w:r>
@@ -3347,14 +3192,7 @@
           <w:rFonts w:ascii="Calibri" w:hAnsi="Calibri"/>
           <w:b/>
         </w:rPr>
-        <w:t>▪</w:t>
-      </w:r>
-      <w:r>
-        <w:rPr>
-          <w:rFonts w:ascii="Calibri" w:hAnsi="Calibri"/>
-          <w:b/>
-        </w:rPr>
-        <w:t xml:space="preserve">  </w:t>
+        <w:t xml:space="preserve">▪  </w:t>
       </w:r>
       <w:r>
         <w:rPr>
@@ -3376,14 +3214,7 @@
           <w:rFonts w:ascii="Calibri" w:hAnsi="Calibri"/>
           <w:b/>
         </w:rPr>
-        <w:t>▪</w:t>
-      </w:r>
-      <w:r>
-        <w:rPr>
-          <w:rFonts w:ascii="Calibri" w:hAnsi="Calibri"/>
-          <w:b/>
-        </w:rPr>
-        <w:t xml:space="preserve">  </w:t>
+        <w:t xml:space="preserve">▪  </w:t>
       </w:r>
       <w:r>
         <w:rPr>
@@ -3405,14 +3236,8 @@
           <w:rFonts w:ascii="Calibri" w:hAnsi="Calibri"/>
           <w:b/>
         </w:rPr>
-        <w:t>▪</w:t>
-      </w:r>
-      <w:r>
-        <w:rPr>
-          <w:rFonts w:ascii="Calibri" w:hAnsi="Calibri"/>
-          <w:b/>
-        </w:rPr>
-        <w:t xml:space="preserve">  </w:t>
+        <w:lastRenderedPageBreak/>
+        <w:t xml:space="preserve">▪  </w:t>
       </w:r>
       <w:r>
         <w:rPr>
@@ -3445,14 +3270,7 @@
           <w:rFonts w:ascii="Calibri" w:hAnsi="Calibri"/>
           <w:b/>
         </w:rPr>
-        <w:t>▪</w:t>
-      </w:r>
-      <w:r>
-        <w:rPr>
-          <w:rFonts w:ascii="Calibri" w:hAnsi="Calibri"/>
-          <w:b/>
-        </w:rPr>
-        <w:t xml:space="preserve">  </w:t>
+        <w:t xml:space="preserve">▪  </w:t>
       </w:r>
       <w:r>
         <w:rPr>
@@ -3519,14 +3337,7 @@
           <w:rFonts w:ascii="Calibri" w:hAnsi="Calibri"/>
           <w:b/>
         </w:rPr>
-        <w:t>▪</w:t>
-      </w:r>
-      <w:r>
-        <w:rPr>
-          <w:rFonts w:ascii="Calibri" w:hAnsi="Calibri"/>
-          <w:b/>
-        </w:rPr>
-        <w:t xml:space="preserve">  </w:t>
+        <w:t xml:space="preserve">▪  </w:t>
       </w:r>
       <w:r>
         <w:t>Exposes the API internally on port 8000.</w:t>
@@ -3542,14 +3353,7 @@
           <w:rFonts w:ascii="Calibri" w:hAnsi="Calibri"/>
           <w:b/>
         </w:rPr>
-        <w:t>▪</w:t>
-      </w:r>
-      <w:r>
-        <w:rPr>
-          <w:rFonts w:ascii="Calibri" w:hAnsi="Calibri"/>
-          <w:b/>
-        </w:rPr>
-        <w:t xml:space="preserve">  </w:t>
+        <w:t xml:space="preserve">▪  </w:t>
       </w:r>
       <w:r>
         <w:t xml:space="preserve">Configured as a </w:t>
@@ -3589,7 +3393,6 @@
           <w:color w:val="4F81BD"/>
           <w:sz w:val="28"/>
         </w:rPr>
-        <w:lastRenderedPageBreak/>
         <w:t>13. GHCR $\rightarrow$ Local Registry $\rightarrow$ Kind Flow</w:t>
       </w:r>
     </w:p>
@@ -3964,6 +3767,7 @@
           <w:rFonts w:ascii="Calibri" w:hAnsi="Calibri"/>
           <w:b/>
         </w:rPr>
+        <w:lastRenderedPageBreak/>
         <w:t xml:space="preserve">•  </w:t>
       </w:r>
       <w:r>
@@ -4080,7 +3884,6 @@
           <w:color w:val="4F81BD"/>
           <w:sz w:val="28"/>
         </w:rPr>
-        <w:lastRenderedPageBreak/>
         <w:t>15. Monitoring</w:t>
       </w:r>
     </w:p>
@@ -4171,14 +3974,7 @@
           <w:rFonts w:ascii="Calibri" w:hAnsi="Calibri"/>
           <w:b/>
         </w:rPr>
-        <w:t>▪</w:t>
-      </w:r>
-      <w:r>
-        <w:rPr>
-          <w:rFonts w:ascii="Calibri" w:hAnsi="Calibri"/>
-          <w:b/>
-        </w:rPr>
-        <w:t xml:space="preserve">  </w:t>
+        <w:t xml:space="preserve">▪  </w:t>
       </w:r>
       <w:r>
         <w:rPr>
@@ -4202,14 +3998,7 @@
           <w:rFonts w:ascii="Calibri" w:hAnsi="Calibri"/>
           <w:b/>
         </w:rPr>
-        <w:t>▪</w:t>
-      </w:r>
-      <w:r>
-        <w:rPr>
-          <w:rFonts w:ascii="Calibri" w:hAnsi="Calibri"/>
-          <w:b/>
-        </w:rPr>
-        <w:t xml:space="preserve">  </w:t>
+        <w:t xml:space="preserve">▪  </w:t>
       </w:r>
       <w:r>
         <w:rPr>
@@ -4244,14 +4033,7 @@
           <w:rFonts w:ascii="Calibri" w:hAnsi="Calibri"/>
           <w:b/>
         </w:rPr>
-        <w:t>▪</w:t>
-      </w:r>
-      <w:r>
-        <w:rPr>
-          <w:rFonts w:ascii="Calibri" w:hAnsi="Calibri"/>
-          <w:b/>
-        </w:rPr>
-        <w:t xml:space="preserve">  </w:t>
+        <w:t xml:space="preserve">▪  </w:t>
       </w:r>
       <w:r>
         <w:rPr>
@@ -4275,14 +4057,7 @@
           <w:rFonts w:ascii="Calibri" w:hAnsi="Calibri"/>
           <w:b/>
         </w:rPr>
-        <w:t>▪</w:t>
-      </w:r>
-      <w:r>
-        <w:rPr>
-          <w:rFonts w:ascii="Calibri" w:hAnsi="Calibri"/>
-          <w:b/>
-        </w:rPr>
-        <w:t xml:space="preserve">  </w:t>
+        <w:t xml:space="preserve">▪  </w:t>
       </w:r>
       <w:r>
         <w:rPr>
@@ -4317,14 +4092,7 @@
           <w:rFonts w:ascii="Calibri" w:hAnsi="Calibri"/>
           <w:b/>
         </w:rPr>
-        <w:t>▪</w:t>
-      </w:r>
-      <w:r>
-        <w:rPr>
-          <w:rFonts w:ascii="Calibri" w:hAnsi="Calibri"/>
-          <w:b/>
-        </w:rPr>
-        <w:t xml:space="preserve">  </w:t>
+        <w:t xml:space="preserve">▪  </w:t>
       </w:r>
       <w:r>
         <w:rPr>
@@ -4511,6 +4279,7 @@
           <w:color w:val="7F7F7F"/>
           <w:sz w:val="24"/>
         </w:rPr>
+        <w:lastRenderedPageBreak/>
         <w:t>Post-Deployment Live Evaluation Metrics (K8s API)</w:t>
       </w:r>
     </w:p>
@@ -4678,7 +4447,6 @@
           <w:rFonts w:ascii="Calibri" w:hAnsi="Calibri"/>
           <w:b/>
         </w:rPr>
-        <w:lastRenderedPageBreak/>
         <w:t xml:space="preserve">•  </w:t>
       </w:r>
       <w:r>
@@ -4963,11 +4731,6 @@
     </w:p>
     <w:p>
       <w:pPr>
-        <w:spacing w:before="80" w:after="80"/>
-      </w:pPr>
-    </w:p>
-    <w:p>
-      <w:pPr>
         <w:pStyle w:val="Heading2"/>
         <w:spacing w:before="280" w:after="120"/>
       </w:pPr>
@@ -4977,6 +4740,7 @@
           <w:color w:val="4F81BD"/>
           <w:sz w:val="28"/>
         </w:rPr>
+        <w:lastRenderedPageBreak/>
         <w:t>18. Conclusion</w:t>
       </w:r>
     </w:p>
@@ -5089,64 +4853,8 @@
         <w:spacing w:after="120"/>
       </w:pPr>
       <w:r>
-        <w:lastRenderedPageBreak/>
         <w:t>The system ensures complete reproducibility, auditability, and observability, bridging the gap between machine learning development and operational excellence.</w:t>
       </w:r>
-    </w:p>
-    <w:p>
-      <w:pPr>
-        <w:spacing w:before="80" w:after="80"/>
-      </w:pPr>
-    </w:p>
-    <w:p>
-      <w:pPr>
-        <w:pStyle w:val="Heading2"/>
-        <w:spacing w:before="280" w:after="120"/>
-      </w:pPr>
-      <w:r>
-        <w:rPr>
-          <w:rFonts w:ascii="Calibri" w:hAnsi="Calibri"/>
-          <w:color w:val="4F81BD"/>
-          <w:sz w:val="28"/>
-        </w:rPr>
-        <w:t>19. GitHub Repository Link</w:t>
-      </w:r>
-    </w:p>
-    <w:p>
-      <w:pPr>
-        <w:spacing w:after="120"/>
-      </w:pPr>
-      <w:r>
-        <w:t>The complete codebase, configurations, and manifests are versioned at:</w:t>
-      </w:r>
-    </w:p>
-    <w:p>
-      <w:pPr>
-        <w:spacing w:after="120"/>
-      </w:pPr>
-      <w:hyperlink r:id="rId6" w:history="1">
-        <w:r>
-          <w:rPr>
-            <w:rStyle w:val="Hyperlink"/>
-            <w:b/>
-          </w:rPr>
-          <w:t>https://github.com/varpeprasanna/BITS-MTech-M</w:t>
-        </w:r>
-        <w:r>
-          <w:rPr>
-            <w:rStyle w:val="Hyperlink"/>
-            <w:b/>
-          </w:rPr>
-          <w:t>L</w:t>
-        </w:r>
-        <w:r>
-          <w:rPr>
-            <w:rStyle w:val="Hyperlink"/>
-            <w:b/>
-          </w:rPr>
-          <w:t>Ops-Assignment-2</w:t>
-        </w:r>
-      </w:hyperlink>
     </w:p>
     <w:sectPr>
       <w:pgSz w:w="12240" w:h="15840"/>

</xml_diff>